<commit_message>
position CV for senior engineering roles
</commit_message>
<xml_diff>
--- a/ats_resume.docx
+++ b/ats_resume.docx
@@ -12,7 +12,7 @@
     </w:p>
     <w:p>
       <w:r>
-        <w:t>Full-Stack Engineer</w:t>
+        <w:t>Senior Full-Stack Engineer</w:t>
       </w:r>
     </w:p>
     <w:p>
@@ -30,35 +30,35 @@
     </w:p>
     <w:p>
       <w:r>
-        <w:t>Full-Stack Engineer with 7+ years of experience building scalable, production-grade web applications across NGO and product environments. Specialized in React, Next.js, and TypeScript, with backend expertise in Django, Ruby on Rails, and FastAPI. Experienced in developing AI-powered features using LLMs, RAG pipelines, and agentic workflows.</w:t>
-      </w:r>
-    </w:p>
-    <w:p>
-      <w:pPr>
-        <w:pStyle w:val="Heading1"/>
-      </w:pPr>
-      <w:r>
-        <w:t>Skills</w:t>
-      </w:r>
-    </w:p>
-    <w:p>
-      <w:r>
-        <w:t>Frontend: React.js, Next.js, Vue.js, Nuxt.js, TypeScript, JavaScript, Tailwind CSS, Semantic HTML, Responsive Design, WCAG 2.1</w:t>
-      </w:r>
-    </w:p>
-    <w:p>
-      <w:r>
-        <w:t>Backend: Node.js, FastAPI, Django, Python, Ruby on Rails, Symfony, PHP, GraphQL, REST APIs, API Integration, Microservices, System Design</w:t>
-      </w:r>
-    </w:p>
-    <w:p>
-      <w:r>
-        <w:t>AI and Data: LangChain, Agentic Workflows, RAG Pipelines, Vector Databases, Google Gemini, PostgreSQL, MySQL, MongoDB</w:t>
-      </w:r>
-    </w:p>
-    <w:p>
-      <w:r>
-        <w:t>DevOps and Testing: Docker, GitLab CI/CD, GitHub Actions, Jest, Vitest, RSpec, PHPUnit, Lighthouse</w:t>
+        <w:t>Senior frontend-leaning full-stack engineer with 8+ years of experience delivering production web applications across civic-tech, nonprofit and early-stage product environments. Deep expertise in React, Next.js and TypeScript, with hands-on backend experience in Django, FastAPI, Node.js and Ruby on Rails. Experienced in modernising legacy systems, improving accessibility and performance, and owning AI-assisted product features from interface and API design through deployment.</w:t>
+      </w:r>
+    </w:p>
+    <w:p>
+      <w:pPr>
+        <w:pStyle w:val="Heading1"/>
+      </w:pPr>
+      <w:r>
+        <w:t>Core Expertise</w:t>
+      </w:r>
+    </w:p>
+    <w:p>
+      <w:r>
+        <w:t>Frontend: React, Next.js, TypeScript, JavaScript, Vue.js, Nuxt.js, HTML, CSS, Tailwind CSS</w:t>
+      </w:r>
+    </w:p>
+    <w:p>
+      <w:r>
+        <w:t>Backend: Python, Django, FastAPI, Node.js, Ruby on Rails, REST APIs, GraphQL</w:t>
+      </w:r>
+    </w:p>
+    <w:p>
+      <w:r>
+        <w:t>Data and applied AI: PostgreSQL, MySQL, MongoDB, vector databases, RAG, LLM integration</w:t>
+      </w:r>
+    </w:p>
+    <w:p>
+      <w:r>
+        <w:t>Quality and delivery: Jest, Vitest, RSpec, PHPUnit, Docker, GitLab CI/CD, GitHub Actions</w:t>
       </w:r>
     </w:p>
     <w:p>
@@ -71,39 +71,47 @@
     </w:p>
     <w:p>
       <w:r>
-        <w:t>Senior Full-Stack Engineer, Velsa Technologies, Berlin 08/2025 - Present Tech Stack: React.js, FastAPI, Python, Django, Google Gemini, Stripe</w:t>
-      </w:r>
-    </w:p>
-    <w:p>
-      <w:pPr>
-        <w:pStyle w:val="ListParagraph"/>
-      </w:pPr>
-      <w:r>
-        <w:t>- Architected a headless contract editor in React with merge fields, inline option toolbars, and toggleable conditional clauses.</w:t>
-      </w:r>
-    </w:p>
-    <w:p>
-      <w:pPr>
-        <w:pStyle w:val="ListParagraph"/>
-      </w:pPr>
-      <w:r>
-        <w:t>- Built a conversational chatbot wizard for contract creation using structured questions, API-backed templates, and automated document population.</w:t>
-      </w:r>
-    </w:p>
-    <w:p>
-      <w:pPr>
-        <w:pStyle w:val="ListParagraph"/>
-      </w:pPr>
-      <w:r>
-        <w:t>- Designed and deployed a FastAPI microservice for AI inference using a multi-chain LLM pipeline, Google Gemini, and vector database retrieval (RAG).</w:t>
-      </w:r>
-    </w:p>
-    <w:p>
-      <w:pPr>
-        <w:pStyle w:val="ListParagraph"/>
-      </w:pPr>
-      <w:r>
-        <w:t>- Integrated Stripe payment flows and webhook handling for contract purchase and download gating.</w:t>
+        <w:t>Senior Full-Stack Engineer, Velsa Technologies, Berlin 08/2025 - 05/2026 Tech Stack: React.js, FastAPI, Python, Django, LLM, RAG, Stripe</w:t>
+      </w:r>
+    </w:p>
+    <w:p>
+      <w:pPr>
+        <w:pStyle w:val="ListParagraph"/>
+      </w:pPr>
+      <w:r>
+        <w:t>- Owned end-to-end delivery of an AI-assisted contract product spanning the React/TypeScript frontend, Django application backend, FastAPI AI service and production integration.</w:t>
+      </w:r>
+    </w:p>
+    <w:p>
+      <w:pPr>
+        <w:pStyle w:val="ListParagraph"/>
+      </w:pPr>
+      <w:r>
+        <w:t>- Built a browser-based contract editor supporting merge fields, inline option controls and conditional clauses.</w:t>
+      </w:r>
+    </w:p>
+    <w:p>
+      <w:pPr>
+        <w:pStyle w:val="ListParagraph"/>
+      </w:pPr>
+      <w:r>
+        <w:t>- Developed a conversational workflow that collected structured user input and populated contract content through backend APIs.</w:t>
+      </w:r>
+    </w:p>
+    <w:p>
+      <w:pPr>
+        <w:pStyle w:val="ListParagraph"/>
+      </w:pPr>
+      <w:r>
+        <w:t>- Designed and deployed a FastAPI service integrating LLM inference and vector retrieval with the existing Django platform.</w:t>
+      </w:r>
+    </w:p>
+    <w:p>
+      <w:pPr>
+        <w:pStyle w:val="ListParagraph"/>
+      </w:pPr>
+      <w:r>
+        <w:t>- Integrated Stripe payment and webhook flows for contract purchasing and controlled document access.</w:t>
       </w:r>
     </w:p>
     <w:p>
@@ -116,6 +124,22 @@
         <w:pStyle w:val="ListParagraph"/>
       </w:pPr>
       <w:r>
+        <w:t>- Owned frontend development and modernisation across 5+ international digital-rights applications, contributing to planning meetings, architecture decisions and delivery across varied technology stacks.</w:t>
+      </w:r>
+    </w:p>
+    <w:p>
+      <w:pPr>
+        <w:pStyle w:val="ListParagraph"/>
+      </w:pPr>
+      <w:r>
+        <w:t>- Defined the frontend architecture for new products and diagnosed architectural bottlenecks in existing systems, including a CMS performance issue affecting editorial teams.</w:t>
+      </w:r>
+    </w:p>
+    <w:p>
+      <w:pPr>
+        <w:pStyle w:val="ListParagraph"/>
+      </w:pPr>
+      <w:r>
         <w:t>- Migrated 3 legacy applications to Next.js and Nuxt.js, reducing initial load times by 30 percent through code splitting and lazy loading.</w:t>
       </w:r>
     </w:p>
@@ -124,31 +148,23 @@
         <w:pStyle w:val="ListParagraph"/>
       </w:pPr>
       <w:r>
-        <w:t>- Achieved WCAG 2.1 AA compliance across 5+ applications using semantic HTML, ARIA roles, keyboard navigation, and Lighthouse audits.</w:t>
-      </w:r>
-    </w:p>
-    <w:p>
-      <w:pPr>
-        <w:pStyle w:val="ListParagraph"/>
-      </w:pPr>
-      <w:r>
-        <w:t>- Implemented structured data, semantic HTML, and metadata strategies to improve organic search visibility.</w:t>
-      </w:r>
-    </w:p>
-    <w:p>
-      <w:pPr>
-        <w:pStyle w:val="ListParagraph"/>
-      </w:pPr>
-      <w:r>
-        <w:t>- Built responsive user interfaces with Tailwind CSS and Tachyons CSS across multiple public-facing projects.</w:t>
-      </w:r>
-    </w:p>
-    <w:p>
-      <w:pPr>
-        <w:pStyle w:val="ListParagraph"/>
-      </w:pPr>
-      <w:r>
-        <w:t>- Refactored Decap CMS schema architecture, reducing query overhead and editorial workflow time by more than 50 percent.</w:t>
+        <w:t>- Drove WCAG 2.1 AA improvements across 5+ applications through semantic structure, keyboard navigation, ARIA usage and accessibility audits.</w:t>
+      </w:r>
+    </w:p>
+    <w:p>
+      <w:pPr>
+        <w:pStyle w:val="ListParagraph"/>
+      </w:pPr>
+      <w:r>
+        <w:t>- Refactored the Decap CMS content architecture, reducing editorial workflow time by more than 50 percent.</w:t>
+      </w:r>
+    </w:p>
+    <w:p>
+      <w:pPr>
+        <w:pStyle w:val="ListParagraph"/>
+      </w:pPr>
+      <w:r>
+        <w:t>- Collaborated with researchers, designers, product owners and non-technical editorial teams to translate complex requirements into maintainable product features.</w:t>
       </w:r>
     </w:p>
     <w:p>
@@ -219,54 +235,21 @@
         <w:pStyle w:val="Heading1"/>
       </w:pPr>
       <w:r>
-        <w:t>Projects</w:t>
-      </w:r>
-    </w:p>
-    <w:p>
-      <w:r>
-        <w:t>Headless Contract Editor, Velsa Technologies Built a document editor with dynamic merge fields and conditional clauses, integrated with an LLM pipeline to automate contract generation and reduce manual drafting work.</w:t>
-      </w:r>
-    </w:p>
-    <w:p>
-      <w:r>
-        <w:t>AI Chatbot Platform, Velsa Technologies Architected a multi-chain LLM pipeline with self-correction loops, vector database retrieval, and a FastAPI microservice layer integrated into a Django backend.</w:t>
-      </w:r>
-    </w:p>
-    <w:p>
-      <w:r>
-        <w:t>JAMstack Platform, Tactical Tech Developed and maintained JAMstack architecture with Next.js, Node.js, and Decap CMS for editorial workflows across multiple projects.</w:t>
-      </w:r>
-    </w:p>
-    <w:p>
-      <w:r>
-        <w:t>GDPR Consent Manager, Tactical Tech Designed and integrated a centralized consent management system across 5+ web applications for cross-product GDPR compliance.</w:t>
-      </w:r>
-    </w:p>
-    <w:p>
-      <w:pPr>
-        <w:pStyle w:val="Heading1"/>
-      </w:pPr>
-      <w:r>
         <w:t>Open Source Projects</w:t>
       </w:r>
     </w:p>
     <w:p>
       <w:r>
+        <w:t>Jobs Tracker Bot: https://github.com/saqibroy/jobs-tracker-bot Python, GitHub Actions, Docker; async aggregator monitoring 11 remote job boards with NGO role classification and Discord/Telegram alerts.</w:t>
+      </w:r>
+    </w:p>
+    <w:p>
+      <w:r>
         <w:t>Web Crawler Dashboard: https://github.com/saqibroy/web-crawler-dashboard React, Go, Docker; URL analyzer with broken-link detection, heading analysis, login-form detection, real-time crawl status, and JWT authentication.</w:t>
       </w:r>
     </w:p>
     <w:p>
       <w:r>
-        <w:t>Jobs Tracker Bot: https://github.com/saqibroy/jobs-tracker-bot Python, GitHub Actions, Docker; async aggregator monitoring 11 remote job boards with NGO role classification and Discord/Telegram alerts.</w:t>
-      </w:r>
-    </w:p>
-    <w:p>
-      <w:r>
-        <w:t>Einbuerger Coach: https://github.com/saqibroy/german-citizenship-test-trainer React, Firestore; citizenship test prep app covering 310 questions with spaced repetition and achievement badges.</w:t>
-      </w:r>
-    </w:p>
-    <w:p>
-      <w:r>
         <w:t>Accessibility Microservice: https://github.com/saqibroy/accessibility-check-microservice Node.js, JSDOM; lightweight WCAG 2.1 A/AA scanner for static HTML and AI-enriched accessibility reports.</w:t>
       </w:r>
     </w:p>
@@ -280,7 +263,7 @@
     </w:p>
     <w:p>
       <w:r>
-        <w:t>M.Sc. Computer Science (Coursework), Technische Universitaet Berlin, Berlin, Germany 04/2017 - 12/2020 Coursework: Machine Learning, Database Systems, Computer Graphics, Advanced Web Development</w:t>
+        <w:t>Graduate coursework in Computer Science, Technische Universitaet Berlin, Berlin, Germany 04/2017 - 12/2020 Coursework: Machine Learning, Database Systems, Computer Graphics, Advanced Web Development</w:t>
       </w:r>
     </w:p>
     <w:p>
@@ -311,7 +294,7 @@
     </w:p>
     <w:p>
       <w:r>
-        <w:t>English: Fluent German: B1 Certificate Urdu/Panjabi: Native</w:t>
+        <w:t>English: Professional working proficiency German: B1 certified Urdu and Punjabi: Native</w:t>
       </w:r>
     </w:p>
     <w:sectPr>

</xml_diff>

<commit_message>
deduplicate Tactical Tech achievements
</commit_message>
<xml_diff>
--- a/ats_resume.docx
+++ b/ats_resume.docx
@@ -124,15 +124,15 @@
         <w:pStyle w:val="ListParagraph"/>
       </w:pPr>
       <w:r>
-        <w:t>- Owned frontend development and modernisation across 5+ international digital-rights applications, contributing to planning meetings, architecture decisions and delivery across varied technology stacks.</w:t>
-      </w:r>
-    </w:p>
-    <w:p>
-      <w:pPr>
-        <w:pStyle w:val="ListParagraph"/>
-      </w:pPr>
-      <w:r>
-        <w:t>- Defined the frontend architecture for new products and diagnosed architectural bottlenecks in existing systems, including a CMS performance issue affecting editorial teams.</w:t>
+        <w:t>- Owned frontend development and modernisation across a portfolio of international digital-rights applications, contributing to planning meetings, architecture decisions and delivery across varied technology stacks.</w:t>
+      </w:r>
+    </w:p>
+    <w:p>
+      <w:pPr>
+        <w:pStyle w:val="ListParagraph"/>
+      </w:pPr>
+      <w:r>
+        <w:t>- Defined the frontend architecture for new products and resolved a Decap CMS content-architecture bottleneck, reducing editorial workflow time by more than 50 percent.</w:t>
       </w:r>
     </w:p>
     <w:p>
@@ -149,14 +149,6 @@
       </w:pPr>
       <w:r>
         <w:t>- Drove WCAG 2.1 AA improvements across 5+ applications through semantic structure, keyboard navigation, ARIA usage and accessibility audits.</w:t>
-      </w:r>
-    </w:p>
-    <w:p>
-      <w:pPr>
-        <w:pStyle w:val="ListParagraph"/>
-      </w:pPr>
-      <w:r>
-        <w:t>- Refactored the Decap CMS content architecture, reducing editorial workflow time by more than 50 percent.</w:t>
       </w:r>
     </w:p>
     <w:p>

</xml_diff>

<commit_message>
refine Tactical Tech accessibility scope
</commit_message>
<xml_diff>
--- a/ats_resume.docx
+++ b/ats_resume.docx
@@ -124,15 +124,15 @@
         <w:pStyle w:val="ListParagraph"/>
       </w:pPr>
       <w:r>
-        <w:t>- Owned frontend development and modernisation across a portfolio of international digital-rights applications, contributing to planning meetings, architecture decisions and delivery across varied technology stacks.</w:t>
-      </w:r>
-    </w:p>
-    <w:p>
-      <w:pPr>
-        <w:pStyle w:val="ListParagraph"/>
-      </w:pPr>
-      <w:r>
-        <w:t>- Defined the frontend architecture for new products and resolved a Decap CMS content-architecture bottleneck, reducing editorial workflow time by more than 50 percent.</w:t>
+        <w:t>- Owned frontend development and modernisation across 5+ international digital-rights applications.</w:t>
+      </w:r>
+    </w:p>
+    <w:p>
+      <w:pPr>
+        <w:pStyle w:val="ListParagraph"/>
+      </w:pPr>
+      <w:r>
+        <w:t>- Defined the frontend architecture for new products and resolved a Decap CMS bottleneck, reducing editorial workflow time by more than 50 percent.</w:t>
       </w:r>
     </w:p>
     <w:p>
@@ -148,15 +148,7 @@
         <w:pStyle w:val="ListParagraph"/>
       </w:pPr>
       <w:r>
-        <w:t>- Drove WCAG 2.1 AA improvements across 5+ applications through semantic structure, keyboard navigation, ARIA usage and accessibility audits.</w:t>
-      </w:r>
-    </w:p>
-    <w:p>
-      <w:pPr>
-        <w:pStyle w:val="ListParagraph"/>
-      </w:pPr>
-      <w:r>
-        <w:t>- Collaborated with researchers, designers, product owners and non-technical editorial teams to translate complex requirements into maintainable product features.</w:t>
+        <w:t>- Collaborated with product, design, research and editorial teams on planning, technical decisions and WCAG 2.1 AA improvements.</w:t>
       </w:r>
     </w:p>
     <w:p>

</xml_diff>

<commit_message>
strengthen Tactical Tech ownership positioning
</commit_message>
<xml_diff>
--- a/ats_resume.docx
+++ b/ats_resume.docx
@@ -124,15 +124,15 @@
         <w:pStyle w:val="ListParagraph"/>
       </w:pPr>
       <w:r>
-        <w:t>- Owned frontend development and modernisation across 5+ international digital-rights applications.</w:t>
-      </w:r>
-    </w:p>
-    <w:p>
-      <w:pPr>
-        <w:pStyle w:val="ListParagraph"/>
-      </w:pPr>
-      <w:r>
-        <w:t>- Defined the frontend architecture for new products and resolved a Decap CMS bottleneck, reducing editorial workflow time by more than 50 percent.</w:t>
+        <w:t>- Owned frontend architecture and delivery across 5+ international digital-rights applications, coordinating technical planning and implementation across varied technology stacks.</w:t>
+      </w:r>
+    </w:p>
+    <w:p>
+      <w:pPr>
+        <w:pStyle w:val="ListParagraph"/>
+      </w:pPr>
+      <w:r>
+        <w:t>- Resolved a Decap CMS bottleneck, reducing editorial workflow time by more than 50 percent.</w:t>
       </w:r>
     </w:p>
     <w:p>

</xml_diff>

<commit_message>
apply final Tactical Tech positioning
</commit_message>
<xml_diff>
--- a/ats_resume.docx
+++ b/ats_resume.docx
@@ -124,31 +124,31 @@
         <w:pStyle w:val="ListParagraph"/>
       </w:pPr>
       <w:r>
-        <w:t>- Owned frontend architecture and delivery across 5+ international digital-rights applications, coordinating technical planning and implementation across varied technology stacks.</w:t>
-      </w:r>
-    </w:p>
-    <w:p>
-      <w:pPr>
-        <w:pStyle w:val="ListParagraph"/>
-      </w:pPr>
-      <w:r>
-        <w:t>- Resolved a Decap CMS bottleneck, reducing editorial workflow time by more than 50 percent.</w:t>
-      </w:r>
-    </w:p>
-    <w:p>
-      <w:pPr>
-        <w:pStyle w:val="ListParagraph"/>
-      </w:pPr>
-      <w:r>
-        <w:t>- Migrated 3 legacy applications to Next.js and Nuxt.js, reducing initial load times by 30 percent through code splitting and lazy loading.</w:t>
-      </w:r>
-    </w:p>
-    <w:p>
-      <w:pPr>
-        <w:pStyle w:val="ListParagraph"/>
-      </w:pPr>
-      <w:r>
-        <w:t>- Collaborated with product, design, research and editorial teams on planning, technical decisions and WCAG 2.1 AA improvements.</w:t>
+        <w:t>- Owned frontend delivery across 5+ international digital-rights applications, making architecture and implementation decisions across React, Vue, Next.js, and Nuxt.js codebases.</w:t>
+      </w:r>
+    </w:p>
+    <w:p>
+      <w:pPr>
+        <w:pStyle w:val="ListParagraph"/>
+      </w:pPr>
+      <w:r>
+        <w:t>- Refactored the Decap CMS content architecture, reducing editorial workflow time by more than 50%.</w:t>
+      </w:r>
+    </w:p>
+    <w:p>
+      <w:pPr>
+        <w:pStyle w:val="ListParagraph"/>
+      </w:pPr>
+      <w:r>
+        <w:t>- Migrated 3 legacy applications to Next.js and Nuxt.js, reducing initial load times by 30% through code splitting and lazy loading.</w:t>
+      </w:r>
+    </w:p>
+    <w:p>
+      <w:pPr>
+        <w:pStyle w:val="ListParagraph"/>
+      </w:pPr>
+      <w:r>
+        <w:t>- Partnered with product, design, research, and editorial teams to translate requirements into accessible and maintainable product features, contributing to WCAG 2.1 AA compliance.</w:t>
       </w:r>
     </w:p>
     <w:p>

</xml_diff>

<commit_message>
strengthen Tactical Tech platform impact
</commit_message>
<xml_diff>
--- a/ats_resume.docx
+++ b/ats_resume.docx
@@ -124,31 +124,31 @@
         <w:pStyle w:val="ListParagraph"/>
       </w:pPr>
       <w:r>
-        <w:t>- Owned frontend delivery across 5+ international digital-rights applications, making architecture and implementation decisions across React, Vue, Next.js, and Nuxt.js codebases.</w:t>
-      </w:r>
-    </w:p>
-    <w:p>
-      <w:pPr>
-        <w:pStyle w:val="ListParagraph"/>
-      </w:pPr>
-      <w:r>
-        <w:t>- Refactored the Decap CMS content architecture, reducing editorial workflow time by more than 50%.</w:t>
-      </w:r>
-    </w:p>
-    <w:p>
-      <w:pPr>
-        <w:pStyle w:val="ListParagraph"/>
-      </w:pPr>
-      <w:r>
-        <w:t>- Migrated 3 legacy applications to Next.js and Nuxt.js, reducing initial load times by 30% through code splitting and lazy loading.</w:t>
-      </w:r>
-    </w:p>
-    <w:p>
-      <w:pPr>
-        <w:pStyle w:val="ListParagraph"/>
-      </w:pPr>
-      <w:r>
-        <w:t>- Partnered with product, design, research, and editorial teams to translate requirements into accessible and maintainable product features, contributing to WCAG 2.1 AA compliance.</w:t>
+        <w:t>- Owned frontend delivery and modernisation across 5+ public-facing platforms used by international audiences, researchers, educators and civil-society organisations.</w:t>
+      </w:r>
+    </w:p>
+    <w:p>
+      <w:pPr>
+        <w:pStyle w:val="ListParagraph"/>
+      </w:pPr>
+      <w:r>
+        <w:t>- Migrated 3 legacy applications to Next.js and Nuxt.js, reducing initial load times by 30% through code splitting, lazy loading and frontend optimisation.</w:t>
+      </w:r>
+    </w:p>
+    <w:p>
+      <w:pPr>
+        <w:pStyle w:val="ListParagraph"/>
+      </w:pPr>
+      <w:r>
+        <w:t>- Refactored the Decap CMS content architecture, reducing editorial workflow time by more than 50% and improving maintainability for non-technical content teams.</w:t>
+      </w:r>
+    </w:p>
+    <w:p>
+      <w:pPr>
+        <w:pStyle w:val="ListParagraph"/>
+      </w:pPr>
+      <w:r>
+        <w:t>- Partnered with product, design, research and editorial teams to translate complex research and educational content into accessible, maintainable web experiences, contributing to WCAG 2.1 AA compliance.</w:t>
       </w:r>
     </w:p>
     <w:p>

</xml_diff>

<commit_message>
finalize CV software engineer positioning
</commit_message>
<xml_diff>
--- a/ats_resume.docx
+++ b/ats_resume.docx
@@ -12,7 +12,7 @@
     </w:p>
     <w:p>
       <w:r>
-        <w:t>Senior Full-Stack Engineer</w:t>
+        <w:t>Senior Software Engineer</w:t>
       </w:r>
     </w:p>
     <w:p>
@@ -30,7 +30,7 @@
     </w:p>
     <w:p>
       <w:r>
-        <w:t>Senior frontend-leaning full-stack engineer with 8+ years of experience delivering production web applications across civic-tech, nonprofit and early-stage product environments. Deep expertise in React, Next.js and TypeScript, with hands-on backend experience in Django, FastAPI, Node.js and Ruby on Rails. Experienced in modernising legacy systems, improving accessibility and performance, and owning AI-assisted product features from interface and API design through deployment.</w:t>
+        <w:t>Senior frontend-leaning software engineer with 8+ years of experience delivering production web applications across nonprofit, civic-tech and early-stage product environments. Deep expertise in React, Next.js and TypeScript, with hands-on backend experience in Django, FastAPI, Node.js and Ruby on Rails. Experienced in taking products from requirements and architecture through implementation and production, modernising legacy systems, and improving accessibility and performance.</w:t>
       </w:r>
     </w:p>
     <w:p>
@@ -43,22 +43,22 @@
     </w:p>
     <w:p>
       <w:r>
-        <w:t>Frontend: React, Next.js, TypeScript, JavaScript, Vue.js, Nuxt.js, HTML, CSS, Tailwind CSS</w:t>
-      </w:r>
-    </w:p>
-    <w:p>
-      <w:r>
-        <w:t>Backend: Python, Django, FastAPI, Node.js, Ruby on Rails, REST APIs, GraphQL</w:t>
-      </w:r>
-    </w:p>
-    <w:p>
-      <w:r>
-        <w:t>Data and applied AI: PostgreSQL, MySQL, MongoDB, vector databases, RAG, LLM integration</w:t>
-      </w:r>
-    </w:p>
-    <w:p>
-      <w:r>
-        <w:t>Quality and delivery: Jest, Vitest, RSpec, PHPUnit, Docker, GitLab CI/CD, GitHub Actions</w:t>
+        <w:t>Frontend: React, Next.js, TypeScript, JavaScript, Vue.js, Nuxt.js, HTML, CSS</w:t>
+      </w:r>
+    </w:p>
+    <w:p>
+      <w:r>
+        <w:t>Backend: Python, Django, FastAPI, Node.js, Ruby on Rails, REST APIs</w:t>
+      </w:r>
+    </w:p>
+    <w:p>
+      <w:r>
+        <w:t>Data and applied AI: PostgreSQL, MySQL, vector databases, RAG, LLM integration</w:t>
+      </w:r>
+    </w:p>
+    <w:p>
+      <w:r>
+        <w:t>Architecture and delivery: application architecture, frontend architecture, API design, requirements engineering, service integration, code review, Docker, CI/CD, automated testing</w:t>
       </w:r>
     </w:p>
     <w:p>
@@ -79,7 +79,15 @@
         <w:pStyle w:val="ListParagraph"/>
       </w:pPr>
       <w:r>
-        <w:t>- Owned end-to-end delivery of an AI-assisted contract product spanning the React/TypeScript frontend, Django application backend, FastAPI AI service and production integration.</w:t>
+        <w:t>- Designed the application architecture and integration flow for an AI-assisted contract workflow connecting a React/TypeScript editor, Django backend and FastAPI AI service.</w:t>
+      </w:r>
+    </w:p>
+    <w:p>
+      <w:pPr>
+        <w:pStyle w:val="ListParagraph"/>
+      </w:pPr>
+      <w:r>
+        <w:t>- Owned end-to-end delivery across the editor, application backend, AI service and production integration.</w:t>
       </w:r>
     </w:p>
     <w:p>
@@ -95,7 +103,7 @@
         <w:pStyle w:val="ListParagraph"/>
       </w:pPr>
       <w:r>
-        <w:t>- Developed a conversational workflow that collected structured user input and populated contract content through backend APIs.</w:t>
+        <w:t>- Developed a conversational workflow that collected structured input and populated contract content through backend APIs.</w:t>
       </w:r>
     </w:p>
     <w:p>
@@ -116,39 +124,47 @@
     </w:p>
     <w:p>
       <w:r>
-        <w:t>Front-End Developer, Tactical Tech (NGO), Berlin, Remote 08/2019 - 04/2025 Tech Stack: React.js, Vue.js, Next.js, Nuxt.js, TypeScript, WCAG 2.1</w:t>
-      </w:r>
-    </w:p>
-    <w:p>
-      <w:pPr>
-        <w:pStyle w:val="ListParagraph"/>
-      </w:pPr>
-      <w:r>
-        <w:t>- Owned frontend delivery and modernisation across 5+ public-facing platforms used by international audiences, researchers, educators and civil-society organisations.</w:t>
-      </w:r>
-    </w:p>
-    <w:p>
-      <w:pPr>
-        <w:pStyle w:val="ListParagraph"/>
-      </w:pPr>
-      <w:r>
-        <w:t>- Migrated 3 legacy applications to Next.js and Nuxt.js, reducing initial load times by 30% through code splitting, lazy loading and frontend optimisation.</w:t>
-      </w:r>
-    </w:p>
-    <w:p>
-      <w:pPr>
-        <w:pStyle w:val="ListParagraph"/>
-      </w:pPr>
-      <w:r>
-        <w:t>- Refactored the Decap CMS content architecture, reducing editorial workflow time by more than 50% and improving maintainability for non-technical content teams.</w:t>
-      </w:r>
-    </w:p>
-    <w:p>
-      <w:pPr>
-        <w:pStyle w:val="ListParagraph"/>
-      </w:pPr>
-      <w:r>
-        <w:t>- Partnered with product, design, research and editorial teams to translate complex research and educational content into accessible, maintainable web experiences, contributing to WCAG 2.1 AA compliance.</w:t>
+        <w:t>Software Engineer / Web Developer, Tactical Tech (NGO), Berlin, Remote 08/2019 - 03/2025 Tech Stack: React.js, Vue.js, Next.js, Nuxt.js, TypeScript, WCAG 2.1</w:t>
+      </w:r>
+    </w:p>
+    <w:p>
+      <w:pPr>
+        <w:pStyle w:val="ListParagraph"/>
+      </w:pPr>
+      <w:r>
+        <w:t>- Led the technical modernisation of Exposing the Invisible (ETI), owning architecture and implementation decisions for its React-to-Vue and CMS migrations.</w:t>
+      </w:r>
+    </w:p>
+    <w:p>
+      <w:pPr>
+        <w:pStyle w:val="ListParagraph"/>
+      </w:pPr>
+      <w:r>
+        <w:t>- Modernised Tactical Tech's main website from React to Next.js and delivered Influence Industry from planning through deployment, alongside work on The Glass Room, Data Detox Kit, Everything Will Be Fine and Digital Enquirer.</w:t>
+      </w:r>
+    </w:p>
+    <w:p>
+      <w:pPr>
+        <w:pStyle w:val="ListParagraph"/>
+      </w:pPr>
+      <w:r>
+        <w:t>- Built and maintained reusable Content API and Search API services and consent-management functionality supporting GDPR-compliant workflows; improved CMS workflows and investigated issues across the application stack.</w:t>
+      </w:r>
+    </w:p>
+    <w:p>
+      <w:pPr>
+        <w:pStyle w:val="ListParagraph"/>
+      </w:pPr>
+      <w:r>
+        <w:t>- Worked with project managers, researchers, designers and editors to turn requirements and Figma designs into implementation plans and reusable, responsive, accessible components, from planning and architecture discussions through code review.</w:t>
+      </w:r>
+    </w:p>
+    <w:p>
+      <w:pPr>
+        <w:pStyle w:val="ListParagraph"/>
+      </w:pPr>
+      <w:r>
+        <w:t>- Improved performance, accessibility, maintainability and developer experience across production applications, including 30% faster initial loads and more than 50% faster editorial workflows.</w:t>
       </w:r>
     </w:p>
     <w:p>
@@ -260,12 +276,25 @@
         <w:pStyle w:val="Heading1"/>
       </w:pPr>
       <w:r>
-        <w:t>Leadership Experience</w:t>
+        <w:t>Volunteer &amp; Leadership</w:t>
       </w:r>
     </w:p>
     <w:p>
       <w:r>
         <w:t>President, Pakistan Student Association, Berlin, Germany 09/2018 - 09/2019 Organized welcome events for 100+ new students and coordinated sports events including cricket tournaments.</w:t>
+      </w:r>
+    </w:p>
+    <w:p>
+      <w:pPr>
+        <w:pStyle w:val="Heading1"/>
+      </w:pPr>
+      <w:r>
+        <w:t>Additional Training</w:t>
+      </w:r>
+    </w:p>
+    <w:p>
+      <w:r>
+        <w:t>Community Basic Life Support &amp; Fire Safety Training, Punjab Emergency Service (Rescue 1122), Gujranwala, Pakistan | 09/2012 Completed a community orientation course in basic life support and fire safety.</w:t>
       </w:r>
     </w:p>
     <w:p>

</xml_diff>